<commit_message>
Insurity CV v2: champions, city managers, contract compliance, mentoring; facts logged
Co-Authored-By: Claude Opus 5.5 <noreply@anthropic.com>
Claude-Session: https://claude.ai/code/session_013yKLQmG2QUPbxd7va6CBm2
</commit_message>
<xml_diff>
--- a/jobs/2026-09-28 Insurity/Kfir_Braunstein_CSM_Insurity.docx
+++ b/jobs/2026-09-28 Insurity/Kfir_Braunstein_CSM_Insurity.docx
@@ -358,7 +358,7 @@
           <w:vertAlign w:val="baseline"/>
           <w:rtl w:val="0"/>
         </w:rPr>
-        <w:t xml:space="preserve">Served as the main technical contact between municipal IT teams and Engineering, and ran QBRs and roadmap presentations for client leadership, reviewing each client's ticket sales revenue and recommending changes to their future events and marketing.</w:t>
+        <w:t xml:space="preserve">Served as the main technical contact between client champions, municipal IT teams, and Engineering, and ran QBRs for city managers and senior city leaders, reviewing ticket sales revenue and recommending changes to future events and marketing.</w:t>
       </w:r>
       <w:r>
         <w:rPr>
@@ -496,7 +496,7 @@
           <w:vertAlign w:val="baseline"/>
           <w:rtl w:val="0"/>
         </w:rPr>
-        <w:t xml:space="preserve">Owned client access setup from provisioning to role assignment, turning complex municipal org structures into a roles and permissions model that let clients roll out to new departments and expand contracts 100%+.</w:t>
+        <w:t xml:space="preserve">Owned client access setup and checked seats, admins, usage, and storage against each contract, turning complex municipal org structures into a roles and permissions model that let clients expand contracts 100%+ into new departments.</w:t>
       </w:r>
       <w:r>
         <w:rPr>
@@ -613,7 +613,7 @@
           <w:vertAlign w:val="baseline"/>
           <w:rtl w:val="0"/>
         </w:rPr>
-        <w:t xml:space="preserve">Ran customer trainings, onboarding sessions, office hours, and webinars for client teams, and led early- and mid-stage sales demos.</w:t>
+        <w:t xml:space="preserve">Ran customer trainings, onboarding sessions, office hours, and webinars for client teams, and mentored junior CSMs.</w:t>
       </w:r>
       <w:r>
         <w:rPr>
@@ -1060,7 +1060,7 @@
           <w:color w:val="1a1a1a"/>
           <w:rtl w:val="0"/>
         </w:rPr>
-        <w:t xml:space="preserve">Onboarding, Health Scoring, Renewals, Escalation Management, Expansion &amp; Upsell, Churn Prevention</w:t>
+        <w:t xml:space="preserve">Onboarding, Health Scoring, Renewals, Escalations, Upsell, Churn Prevention, Customer Champions</w:t>
       </w:r>
       <w:r>
         <w:rPr>
@@ -1089,7 +1089,7 @@
           <w:color w:val="1a1a1a"/>
           <w:rtl w:val="0"/>
         </w:rPr>
-        <w:t xml:space="preserve">Value &amp; ROI Cases, Renewal Negotiation Support, QBRs, Roadmap Presentations, Payments &amp; Billing</w:t>
+        <w:t xml:space="preserve">ROI Cases, Renewal Support, QBRs, Roadmap Presentations, Contract Compliance, Change Requests &amp; SOWs</w:t>
       </w:r>
       <w:r>
         <w:rPr>
@@ -1118,7 +1118,7 @@
           <w:color w:val="1a1a1a"/>
           <w:rtl w:val="0"/>
         </w:rPr>
-        <w:t xml:space="preserve">Customer Training, Office Hours, Webinars, Live Demos, Knowledge Base, Process Building</w:t>
+        <w:t xml:space="preserve">Customer Training, Office Hours, Webinars, Live Demos, Knowledge Base, Process Building, Mentoring</w:t>
       </w:r>
       <w:r>
         <w:rPr>
@@ -1176,7 +1176,7 @@
           <w:color w:val="1a1a1a"/>
           <w:rtl w:val="0"/>
         </w:rPr>
-        <w:t xml:space="preserve">HubSpot, Intercom, ClickUp, Jam.dev, Stripe, Postman, Confluence, Excel, PowerPoint</w:t>
+        <w:t xml:space="preserve">HubSpot, Intercom, ClickUp, Jam.dev, Stripe, Postman, Confluence, Figma, Excel, PowerPoint, Word</w:t>
       </w:r>
       <w:r>
         <w:rPr>
@@ -1736,324 +1736,4 @@
     </w:rPr>
   </w:style>
 </w:styles>
-</file>
-
-<file path=word/theme/theme1.xml><?xml version="1.0" encoding="utf-8"?>
-<a:theme xmlns:a="http://schemas.openxmlformats.org/drawingml/2006/main" name="Office Theme">
-  <a:themeElements>
-    <a:clrScheme name="Office">
-      <a:dk1>
-        <a:sysClr val="windowText" lastClr="000000"/>
-      </a:dk1>
-      <a:lt1>
-        <a:sysClr val="window" lastClr="FFFFFF"/>
-      </a:lt1>
-      <a:dk2>
-        <a:srgbClr val="1F497D"/>
-      </a:dk2>
-      <a:lt2>
-        <a:srgbClr val="EEECE1"/>
-      </a:lt2>
-      <a:accent1>
-        <a:srgbClr val="4F81BD"/>
-      </a:accent1>
-      <a:accent2>
-        <a:srgbClr val="C0504D"/>
-      </a:accent2>
-      <a:accent3>
-        <a:srgbClr val="9BBB59"/>
-      </a:accent3>
-      <a:accent4>
-        <a:srgbClr val="8064A2"/>
-      </a:accent4>
-      <a:accent5>
-        <a:srgbClr val="4BACC6"/>
-      </a:accent5>
-      <a:accent6>
-        <a:srgbClr val="F79646"/>
-      </a:accent6>
-      <a:hlink>
-        <a:srgbClr val="0000FF"/>
-      </a:hlink>
-      <a:folHlink>
-        <a:srgbClr val="800080"/>
-      </a:folHlink>
-    </a:clrScheme>
-    <a:fontScheme name="Office">
-      <a:majorFont>
-        <a:latin typeface="Calibri"/>
-        <a:ea typeface=""/>
-        <a:cs typeface=""/>
-        <a:font script="Jpan" typeface="ＭＳ ゴシック"/>
-        <a:font script="Hang" typeface="맑은 고딕"/>
-        <a:font script="Hans" typeface="宋体"/>
-        <a:font script="Hant" typeface="新細明體"/>
-        <a:font script="Arab" typeface="Times New Roman"/>
-        <a:font script="Hebr" typeface="Times New Roman"/>
-        <a:font script="Thai" typeface="Angsana New"/>
-        <a:font script="Ethi" typeface="Nyala"/>
-        <a:font script="Beng" typeface="Vrinda"/>
-        <a:font script="Gujr" typeface="Shruti"/>
-        <a:font script="Khmr" typeface="MoolBoran"/>
-        <a:font script="Knda" typeface="Tunga"/>
-        <a:font script="Guru" typeface="Raavi"/>
-        <a:font script="Cans" typeface="Euphemia"/>
-        <a:font script="Cher" typeface="Plantagenet Cherokee"/>
-        <a:font script="Yiii" typeface="Microsoft Yi Baiti"/>
-        <a:font script="Tibt" typeface="Microsoft Himalaya"/>
-        <a:font script="Thaa" typeface="MV Boli"/>
-        <a:font script="Deva" typeface="Mangal"/>
-        <a:font script="Telu" typeface="Gautami"/>
-        <a:font script="Taml" typeface="Latha"/>
-        <a:font script="Syrc" typeface="Estrangelo Edessa"/>
-        <a:font script="Orya" typeface="Kalinga"/>
-        <a:font script="Mlym" typeface="Kartika"/>
-        <a:font script="Laoo" typeface="DokChampa"/>
-        <a:font script="Sinh" typeface="Iskoola Pota"/>
-        <a:font script="Mong" typeface="Mongolian Baiti"/>
-        <a:font script="Viet" typeface="Times New Roman"/>
-        <a:font script="Uigh" typeface="Microsoft Uighur"/>
-        <a:font script="Geor" typeface="Sylfaen"/>
-      </a:majorFont>
-      <a:minorFont>
-        <a:latin typeface="Cambria"/>
-        <a:ea typeface=""/>
-        <a:cs typeface=""/>
-        <a:font script="Jpan" typeface="ＭＳ 明朝"/>
-        <a:font script="Hang" typeface="맑은 고딕"/>
-        <a:font script="Hans" typeface="宋体"/>
-        <a:font script="Hant" typeface="新細明體"/>
-        <a:font script="Arab" typeface="Arial"/>
-        <a:font script="Hebr" typeface="Arial"/>
-        <a:font script="Thai" typeface="Cordia New"/>
-        <a:font script="Ethi" typeface="Nyala"/>
-        <a:font script="Beng" typeface="Vrinda"/>
-        <a:font script="Gujr" typeface="Shruti"/>
-        <a:font script="Khmr" typeface="DaunPenh"/>
-        <a:font script="Knda" typeface="Tunga"/>
-        <a:font script="Guru" typeface="Raavi"/>
-        <a:font script="Cans" typeface="Euphemia"/>
-        <a:font script="Cher" typeface="Plantagenet Cherokee"/>
-        <a:font script="Yiii" typeface="Microsoft Yi Baiti"/>
-        <a:font script="Tibt" typeface="Microsoft Himalaya"/>
-        <a:font script="Thaa" typeface="MV Boli"/>
-        <a:font script="Deva" typeface="Mangal"/>
-        <a:font script="Telu" typeface="Gautami"/>
-        <a:font script="Taml" typeface="Latha"/>
-        <a:font script="Syrc" typeface="Estrangelo Edessa"/>
-        <a:font script="Orya" typeface="Kalinga"/>
-        <a:font script="Mlym" typeface="Kartika"/>
-        <a:font script="Laoo" typeface="DokChampa"/>
-        <a:font script="Sinh" typeface="Iskoola Pota"/>
-        <a:font script="Mong" typeface="Mongolian Baiti"/>
-        <a:font script="Viet" typeface="Arial"/>
-        <a:font script="Uigh" typeface="Microsoft Uighur"/>
-        <a:font script="Geor" typeface="Sylfaen"/>
-      </a:minorFont>
-    </a:fontScheme>
-    <a:fmtScheme name="Office">
-      <a:fillStyleLst>
-        <a:solidFill>
-          <a:schemeClr val="phClr"/>
-        </a:solidFill>
-        <a:gradFill rotWithShape="1">
-          <a:gsLst>
-            <a:gs pos="0">
-              <a:schemeClr val="phClr">
-                <a:tint val="50000"/>
-                <a:satMod val="300000"/>
-              </a:schemeClr>
-            </a:gs>
-            <a:gs pos="35000">
-              <a:schemeClr val="phClr">
-                <a:tint val="37000"/>
-                <a:satMod val="300000"/>
-              </a:schemeClr>
-            </a:gs>
-            <a:gs pos="100000">
-              <a:schemeClr val="phClr">
-                <a:tint val="15000"/>
-                <a:satMod val="350000"/>
-              </a:schemeClr>
-            </a:gs>
-          </a:gsLst>
-          <a:lin ang="16200000" scaled="1"/>
-        </a:gradFill>
-        <a:gradFill rotWithShape="1">
-          <a:gsLst>
-            <a:gs pos="0">
-              <a:schemeClr val="phClr">
-                <a:tint val="100000"/>
-                <a:shade val="100000"/>
-                <a:satMod val="130000"/>
-              </a:schemeClr>
-            </a:gs>
-            <a:gs pos="100000">
-              <a:schemeClr val="phClr">
-                <a:tint val="50000"/>
-                <a:shade val="100000"/>
-                <a:satMod val="350000"/>
-              </a:schemeClr>
-            </a:gs>
-          </a:gsLst>
-          <a:lin ang="16200000" scaled="0"/>
-        </a:gradFill>
-      </a:fillStyleLst>
-      <a:lnStyleLst>
-        <a:ln w="9525" cap="flat" cmpd="sng" algn="ctr">
-          <a:solidFill>
-            <a:schemeClr val="phClr">
-              <a:shade val="95000"/>
-              <a:satMod val="105000"/>
-            </a:schemeClr>
-          </a:solidFill>
-          <a:prstDash val="solid"/>
-        </a:ln>
-        <a:ln w="25400" cap="flat" cmpd="sng" algn="ctr">
-          <a:solidFill>
-            <a:schemeClr val="phClr"/>
-          </a:solidFill>
-          <a:prstDash val="solid"/>
-        </a:ln>
-        <a:ln w="38100" cap="flat" cmpd="sng" algn="ctr">
-          <a:solidFill>
-            <a:schemeClr val="phClr"/>
-          </a:solidFill>
-          <a:prstDash val="solid"/>
-        </a:ln>
-      </a:lnStyleLst>
-      <a:effectStyleLst>
-        <a:effectStyle>
-          <a:effectLst>
-            <a:outerShdw blurRad="40000" dist="20000" dir="5400000" rotWithShape="0">
-              <a:srgbClr val="000000">
-                <a:alpha val="38000"/>
-              </a:srgbClr>
-            </a:outerShdw>
-          </a:effectLst>
-        </a:effectStyle>
-        <a:effectStyle>
-          <a:effectLst>
-            <a:outerShdw blurRad="40000" dist="23000" dir="5400000" rotWithShape="0">
-              <a:srgbClr val="000000">
-                <a:alpha val="35000"/>
-              </a:srgbClr>
-            </a:outerShdw>
-          </a:effectLst>
-        </a:effectStyle>
-        <a:effectStyle>
-          <a:effectLst>
-            <a:outerShdw blurRad="40000" dist="23000" dir="5400000" rotWithShape="0">
-              <a:srgbClr val="000000">
-                <a:alpha val="35000"/>
-              </a:srgbClr>
-            </a:outerShdw>
-          </a:effectLst>
-          <a:scene3d>
-            <a:camera prst="orthographicFront">
-              <a:rot lat="0" lon="0" rev="0"/>
-            </a:camera>
-            <a:lightRig rig="threePt" dir="t">
-              <a:rot lat="0" lon="0" rev="1200000"/>
-            </a:lightRig>
-          </a:scene3d>
-          <a:sp3d>
-            <a:bevelT w="63500" h="25400"/>
-          </a:sp3d>
-        </a:effectStyle>
-      </a:effectStyleLst>
-      <a:bgFillStyleLst>
-        <a:solidFill>
-          <a:schemeClr val="phClr"/>
-        </a:solidFill>
-        <a:gradFill rotWithShape="1">
-          <a:gsLst>
-            <a:gs pos="0">
-              <a:schemeClr val="phClr">
-                <a:tint val="40000"/>
-                <a:satMod val="350000"/>
-              </a:schemeClr>
-            </a:gs>
-            <a:gs pos="40000">
-              <a:schemeClr val="phClr">
-                <a:tint val="45000"/>
-                <a:shade val="99000"/>
-                <a:satMod val="350000"/>
-              </a:schemeClr>
-            </a:gs>
-            <a:gs pos="100000">
-              <a:schemeClr val="phClr">
-                <a:shade val="20000"/>
-                <a:satMod val="255000"/>
-              </a:schemeClr>
-            </a:gs>
-          </a:gsLst>
-          <a:path path="circle">
-            <a:fillToRect l="50000" t="-80000" r="50000" b="180000"/>
-          </a:path>
-        </a:gradFill>
-        <a:gradFill rotWithShape="1">
-          <a:gsLst>
-            <a:gs pos="0">
-              <a:schemeClr val="phClr">
-                <a:tint val="80000"/>
-                <a:satMod val="300000"/>
-              </a:schemeClr>
-            </a:gs>
-            <a:gs pos="100000">
-              <a:schemeClr val="phClr">
-                <a:shade val="30000"/>
-                <a:satMod val="200000"/>
-              </a:schemeClr>
-            </a:gs>
-          </a:gsLst>
-          <a:path path="circle">
-            <a:fillToRect l="50000" t="50000" r="50000" b="50000"/>
-          </a:path>
-        </a:gradFill>
-      </a:bgFillStyleLst>
-    </a:fmtScheme>
-  </a:themeElements>
-  <a:objectDefaults>
-    <a:spDef>
-      <a:spPr/>
-      <a:bodyPr/>
-      <a:lstStyle/>
-      <a:style>
-        <a:lnRef idx="1">
-          <a:schemeClr val="accent1"/>
-        </a:lnRef>
-        <a:fillRef idx="3">
-          <a:schemeClr val="accent1"/>
-        </a:fillRef>
-        <a:effectRef idx="2">
-          <a:schemeClr val="accent1"/>
-        </a:effectRef>
-        <a:fontRef idx="minor">
-          <a:schemeClr val="lt1"/>
-        </a:fontRef>
-      </a:style>
-    </a:spDef>
-    <a:lnDef>
-      <a:spPr/>
-      <a:bodyPr/>
-      <a:lstStyle/>
-      <a:style>
-        <a:lnRef idx="2">
-          <a:schemeClr val="accent1"/>
-        </a:lnRef>
-        <a:fillRef idx="0">
-          <a:schemeClr val="accent1"/>
-        </a:fillRef>
-        <a:effectRef idx="1">
-          <a:schemeClr val="accent1"/>
-        </a:effectRef>
-        <a:fontRef idx="minor">
-          <a:schemeClr val="tx1"/>
-        </a:fontRef>
-      </a:style>
-    </a:lnDef>
-  </a:objectDefaults>
-  <a:extraClrSchemeLst/>
-</a:theme>
 </file>
</xml_diff>